<commit_message>
Organize repo for handover: README at root, design/research docs under docs/
- README.md (developer handover guide) now at the repository root so it
  renders as the GitHub front page; links fixed for the new location
- design corpus (MCP-*.md) moved to docs/design/
- STORM briefings moved to docs/research/
- handover docx document map updated to match

Co-Authored-By: Claude Fable 5 <noreply@anthropic.com>
</commit_message>
<xml_diff>
--- a/handover/MCP-Gateway-Documentation.docx
+++ b/handover/MCP-Gateway-Documentation.docx
@@ -92,7 +92,7 @@
           <w:i w:val="0"/>
           <w:sz w:val="20"/>
         </w:rPr>
-        <w:t>Companion file: README.md (developer quickstart, in the same folder)</w:t>
+        <w:t>Companion file: README.md (developer quickstart, at the repository root)</w:t>
       </w:r>
     </w:p>
     <w:p>
@@ -5848,7 +5848,7 @@
               <w:rPr>
                 <w:sz w:val="19"/>
               </w:rPr>
-              <w:t>handover/README.md</w:t>
+              <w:t>README.md (repository root)</w:t>
             </w:r>
           </w:p>
         </w:tc>
@@ -5862,7 +5862,7 @@
               <w:rPr>
                 <w:sz w:val="19"/>
               </w:rPr>
-              <w:t>developer quickstart: layout, install, tests, deployment, gotchas — the file to read first inside git</w:t>
+              <w:t>developer quickstart: layout, install, tests, deployment, gotchas — the front page of the repository</w:t>
             </w:r>
           </w:p>
         </w:tc>
@@ -6088,7 +6088,7 @@
               <w:rPr>
                 <w:sz w:val="19"/>
               </w:rPr>
-              <w:t>repo-root MCP-*.md files</w:t>
+              <w:t>docs/design/</w:t>
             </w:r>
           </w:p>
         </w:tc>
@@ -6103,6 +6103,36 @@
                 <w:sz w:val="19"/>
               </w:rPr>
               <w:t>the design/research corpus (v10 architecture BuildSpec, security blueprint, auth redesign, critiques). Background inputs — PROJECT-PLAN.md supersedes them where they disagree</w:t>
+            </w:r>
+          </w:p>
+        </w:tc>
+      </w:tr>
+      <w:tr>
+        <w:tc>
+          <w:tcPr>
+            <w:tcW w:type="dxa" w:w="3600"/>
+          </w:tcPr>
+          <w:p>
+            <w:r/>
+            <w:r>
+              <w:rPr>
+                <w:sz w:val="19"/>
+              </w:rPr>
+              <w:t>docs/research/</w:t>
+            </w:r>
+          </w:p>
+        </w:tc>
+        <w:tc>
+          <w:tcPr>
+            <w:tcW w:type="dxa" w:w="6336"/>
+          </w:tcPr>
+          <w:p>
+            <w:r/>
+            <w:r>
+              <w:rPr>
+                <w:sz w:val="19"/>
+              </w:rPr>
+              <w:t>STORM research briefings: the MCP server landscape and company stacks</w:t>
             </w:r>
           </w:p>
         </w:tc>

</xml_diff>